<commit_message>
Add bulk rename and custom combined categories
- redesign Customize with focusable category names and paged item lists
- add rule-based bulk rename, editable auto cleanup, review, and restore-original flow
- add per-profile custom combined categories with move/copy and manual ordering
- preserve custom category membership and moved-origin state across sync and backup
- improve TV popup focus, keyboard avoidance, and focus restoration
- update release notes, README, user guide, and product brief

Closes #86
Closes #87
</commit_message>
<xml_diff>
--- a/extras/OwnTV_Master_Product_Brief.docx
+++ b/extras/OwnTV_Master_Product_Brief.docx
@@ -1171,11 +1171,7 @@
         <w:pStyle w:val="ListBullet"/>
       </w:pPr>
       <w:r>
-        <w:rPr>
-          <w:rFonts w:ascii="Cambria" w:hAnsi="Cambria"/>
-          <w:sz w:val="22"/>
-        </w:rPr>
-        <w:t>Customize per profile: hide, rename, reorder categories; hide/unhide individual channels, movies and series; optional screen PIN (one-step or jump to top/bottom)</w:t>
+        <w:t>Customize per profile: focus a category name to open its paged item list; hide, rename and reorder categories or individual channels, movies and series; recover hidden items; and optionally protect the screen with a PIN.</w:t>
       </w:r>
     </w:p>
     <w:p>
@@ -1183,7 +1179,23 @@
         <w:pStyle w:val="ListBullet"/>
       </w:pPr>
       <w:r>
-        <w:t>Per-item context menu (long-press): Move (D-pad reorder inside a folder/Favorites), Remove from History, and Download / Download all episodes for movies &amp; series.</w:t>
+        <w:t>Bulk rename channels, movies and series with ordered add/remove prefix or suffix rules, editable automatic cleanup, a complete review before writing, and restore-original undo; renames are per profile, survive re-syncs and appear throughout Browse and Search.</w:t>
+      </w:r>
+    </w:p>
+    <w:p>
+      <w:pPr>
+        <w:pStyle w:val="ListBullet"/>
+      </w:pPr>
+      <w:r>
+        <w:t>Create custom combined categories for Live TV, Movies or Series; move or copy items from provider folders, Favorites or other custom categories, manually reorder their contents, and rename, hide or delete the category without deleting provider content.</w:t>
+      </w:r>
+    </w:p>
+    <w:p>
+      <w:pPr>
+        <w:pStyle w:val="ListBullet"/>
+      </w:pPr>
+      <w:r>
+        <w:t>Per-item context menu (long-press): Move within the current folder/Favorites, move or copy to a custom category, remove from History, and Download / Download all episodes for movies and series.</w:t>
       </w:r>
     </w:p>
     <w:p>
@@ -2515,11 +2527,7 @@
         <w:pStyle w:val="ListBullet"/>
       </w:pPr>
       <w:r>
-        <w:rPr>
-          <w:rFonts w:ascii="Cambria" w:hAnsi="Cambria"/>
-          <w:sz w:val="22"/>
-        </w:rPr>
-        <w:t>19-entity Room schema: profiles &amp; sources (cross-ref for sharing), content (categories/channels/movies/series/seasons/episodes), per-profile favorites/history/progress/downloads, EPG channels/programmes, FTS4 search tables</w:t>
+        <w:t>Room schema: profiles &amp; sources (cross-ref for sharing), content (categories/channels/movies/series/seasons/episodes), per-profile favorites/history/progress/downloads, EPG channels/programmes, FTS4 search tables</w:t>
       </w:r>
     </w:p>
     <w:p>

</xml_diff>

<commit_message>
Fix Live TV zap context and AFR blackouts
- preserve Favorites, History, All, folder, and custom-category context
  during full-screen Live TV zapping and channel-list browsing
- keep the preview panel’s provider category as separate metadata
- make categories selected inside the player update the real zap list
- default auto frame rate to Off and reset it once for v4.1.6 users
- preserve AFR choices made after the one-time migration
- disable ExoPlayer, mpv, and window-level frame-rate switching when
  AFR is Off, including clearing existing surface hints
- update changelogs, README, user guide, and product brief
</commit_message>
<xml_diff>
--- a/extras/OwnTV_Master_Product_Brief.docx
+++ b/extras/OwnTV_Master_Product_Brief.docx
@@ -396,6 +396,14 @@
         <w:pStyle w:val="ListBullet"/>
       </w:pPr>
       <w:r>
+        <w:t>Auto frame rate (opt-in, off by default) — matches full-screen video to a supported display refresh rate. ExoPlayer, mpv, and the window-level display controller all obey the same toggle; v4.1.6 resets existing installs to Off once, then preserves later user choices.</w:t>
+      </w:r>
+    </w:p>
+    <w:p>
+      <w:pPr>
+        <w:pStyle w:val="ListBullet"/>
+      </w:pPr>
+      <w:r>
         <w:rPr>
           <w:rFonts w:ascii="Cambria" w:hAnsi="Cambria"/>
           <w:sz w:val="22"/>
@@ -585,7 +593,15 @@
           <w:rFonts w:ascii="Cambria" w:hAnsi="Cambria"/>
           <w:sz w:val="22"/>
         </w:rPr>
-        <w:t>In-player channel list — press Left (controls hidden) to slide a channel list over the video; the current channel is highlighted</w:t>
+        <w:t>In-player channel list — press Left (controls hidden) to browse the context the channel was opened from (Favorites, History, All Channels, provider folder, or custom category); the provider category remains separate preview metadata.</w:t>
+      </w:r>
+    </w:p>
+    <w:p>
+      <w:pPr>
+        <w:pStyle w:val="ListBullet"/>
+      </w:pPr>
+      <w:r>
+        <w:t>In-player category browser — press Left again to choose a provider category without leaving full screen; the selected category becomes the new channel-list and zapping context.</w:t>
       </w:r>
     </w:p>
     <w:p>

</xml_diff>

<commit_message>
docs: document multilingual first-run experience
</commit_message>
<xml_diff>
--- a/extras/OwnTV_Master_Product_Brief.docx
+++ b/extras/OwnTV_Master_Product_Brief.docx
@@ -139,6 +139,14 @@
         <w:pStyle w:val="ListBullet"/>
       </w:pPr>
       <w:r>
+        <w:t>Language-first onboarding and a fully localized interface for 24 packaged UI languages</w:t>
+      </w:r>
+    </w:p>
+    <w:p>
+      <w:pPr>
+        <w:pStyle w:val="ListBullet"/>
+      </w:pPr>
+      <w:r>
         <w:rPr>
           <w:rFonts w:ascii="Cambria" w:hAnsi="Cambria"/>
           <w:sz w:val="22"/>
@@ -167,7 +175,7 @@
           <w:rFonts w:ascii="Cambria" w:hAnsi="Cambria"/>
           <w:sz w:val="22"/>
         </w:rPr>
-        <w:t>Open-source (MIT), built with the help of AI</w:t>
+        <w:t>Open-source (GPLv3), built with the help of AI</w:t>
       </w:r>
     </w:p>
     <w:p>
@@ -1884,6 +1892,67 @@
           <w:sz w:val="36"/>
         </w:rPr>
         <w:t>Personalization &amp; Settings</w:t>
+      </w:r>
+    </w:p>
+    <w:p/>
+    <w:p>
+      <w:pPr/>
+      <w:r>
+        <w:rPr>
+          <w:rFonts w:ascii="Cambria" w:hAnsi="Cambria" w:eastAsia="Cambria"/>
+          <w:b/>
+          <w:color w:val="1A1A2E"/>
+          <w:sz w:val="24"/>
+        </w:rPr>
+        <w:t>Language &amp; First-Run Experience</w:t>
+      </w:r>
+    </w:p>
+    <w:p>
+      <w:pPr>
+        <w:pStyle w:val="ListBullet"/>
+      </w:pPr>
+      <w:r>
+        <w:t>Fresh installations begin with a language selector before Get Started: System default follows the TV, while an explicit choice switches the interface immediately.</w:t>
+      </w:r>
+    </w:p>
+    <w:p>
+      <w:pPr>
+        <w:pStyle w:val="ListBullet"/>
+      </w:pPr>
+      <w:r>
+        <w:t>English plus 23 complete packaged translations cover all 1,771 source entries; 19 additional requested languages remain catalogue-only until they reach the reviewed readiness threshold.</w:t>
+      </w:r>
+    </w:p>
+    <w:p>
+      <w:pPr>
+        <w:pStyle w:val="ListBullet"/>
+      </w:pPr>
+      <w:r>
+        <w:t>The welcome, disclaimer, setup-choice, and add-playlist pages share a compact OwnTV visual system with sans-serif type, a subtle animated teal glow and ring, clear D-pad focus, and standard focus-isolated popups.</w:t>
+      </w:r>
+    </w:p>
+    <w:p>
+      <w:pPr>
+        <w:pStyle w:val="ListBullet"/>
+      </w:pPr>
+      <w:r>
+        <w:t>Settings → Look &amp; Feel → Language provides a searchable picker with native names. App language is independent of profiles and the separate TMDB metadata-language setting, and survives restart and backup/restore.</w:t>
+      </w:r>
+    </w:p>
+    <w:p>
+      <w:pPr>
+        <w:pStyle w:val="ListBullet"/>
+      </w:pPr>
+      <w:r>
+        <w:t>Locale-aware plurals, dates, times, numbers, RTL navigation, font fallback, and English fallback apply across the UI, notifications, launcher text, companion pages, player messages, and diagnostics without changing playback or sync behavior.</w:t>
+      </w:r>
+    </w:p>
+    <w:p>
+      <w:pPr>
+        <w:pStyle w:val="ListBullet"/>
+      </w:pPr>
+      <w:r>
+        <w:t>A generated locale catalogue, six resource domains, Hosted Weblate contribution paths, 132 tooling tests, and CI checks protect placeholders, plural forms, formatting, overflow, and release packaging.</w:t>
       </w:r>
     </w:p>
     <w:p/>

</xml_diff>

<commit_message>
feat(settings): support hidden third browse panels
- allow Live Preview and Movie/Series Poster panels to be set to 0%
- remove hidden panels and unused gaps while preserving the 100% total
- warn and disable Live Preview video when its panel is hidden
- block preview video until the Live Preview panel is restored
- focus Settings on Profiles instead of Language
- export playback reports to the public Download folder
- add panel-width unit tests and update project documentation
</commit_message>
<xml_diff>
--- a/extras/OwnTV_Master_Product_Brief.docx
+++ b/extras/OwnTV_Master_Product_Brief.docx
@@ -1120,7 +1120,7 @@
           <w:rFonts w:ascii="Cambria" w:hAnsi="Cambria"/>
           <w:sz w:val="22"/>
         </w:rPr>
-        <w:t>Rounded content panels (Option A Clean + Premium): every screen sits inside rounded boxes (22dp corners, hairline outlineVariant borders, subtle surfaceContainerLowest fill). Per-region boxing: 3 boxes on Movies/Series/Live (category rail, content grid, preview), 1 box on single-column screens (Home, Search, Downloads, Guide, Settings)</w:t>
+        <w:t>Rounded content panels (Option A Clean + Premium): every screen sits inside rounded boxes (22dp corners, hairline outlineVariant borders, subtle surfaceContainerLowest fill). Movies, Series and Live normally use 3 boxes (category rail, content grid, preview); setting preview/poster to 0% removes the third box and its extra gap. Single-column screens use 1 box (Home, Search, Downloads, Guide, Settings).</w:t>
       </w:r>
     </w:p>
     <w:p>
@@ -1920,7 +1920,7 @@
         <w:pStyle w:val="ListBullet"/>
       </w:pPr>
       <w:r>
-        <w:t>English plus 23 complete packaged translations cover all 1,771 source entries; 19 additional requested languages remain catalogue-only until they reach the reviewed readiness threshold.</w:t>
+        <w:t>English plus 23 packaged translations cover the established 1,771-entry catalogue; newly added text safely falls back to English until translations catch up. Nineteen additional requested languages remain catalogue-only until they reach the reviewed readiness threshold.</w:t>
       </w:r>
     </w:p>
     <w:p>
@@ -2012,7 +2012,7 @@
           <w:rFonts w:ascii="Cambria" w:hAnsi="Cambria"/>
           <w:sz w:val="22"/>
         </w:rPr>
-        <w:t>Panel Width Adjustment – per-section manual sizing of the three browse panels (category rail, item list/grid, preview/poster) for Live TV, Movies and Series; each panel is a share of the screen and the three must total 100%, validated on save</w:t>
+        <w:t>Panel Width Adjustment - per-section manual sizing for Live TV, Movies and Series. Category and List stay at 10% or more; Preview/Poster may be 0% to hide that panel and remove its gap; saving still requires an exact 100% total. Hiding Live Preview warns first, turns preview video off, and blocks enabling it until the panel is restored.</w:t>
       </w:r>
     </w:p>
     <w:p>
@@ -2171,6 +2171,18 @@
           <w:sz w:val="22"/>
         </w:rPr>
         <w:t>Live latency (Low / Balanced / Stable / Custom) and Pre-buffer live streams, with a per-playlist Pre-buffer override</w:t>
+      </w:r>
+    </w:p>
+    <w:p>
+      <w:pPr>
+        <w:pStyle w:val="ListBullet"/>
+      </w:pPr>
+      <w:r>
+        <w:rPr>
+          <w:rFonts w:ascii="Cambria" w:hAnsi="Cambria"/>
+          <w:sz w:val="22"/>
+        </w:rPr>
+        <w:t>Playback diagnostics - a readable history of failures, fallbacks and reports, with optional detailed tracing. Export writes Download/owntv-playback-report.txt in the public Download folder, creates the folder when missing, and replaces the previous report.</w:t>
       </w:r>
     </w:p>
     <w:p>

</xml_diff>

<commit_message>
feat(stalker): support advanced device identification
(cherry picked from commit 710e3b5dbb80d067711aaa5b77204c52c0d0a409)

Adapted for this fork: upstream shipped the four Stalker identity columns as its own
v29, but this fork had already published a different v29
(metadata_cache.spokenLanguagesJson), so the two claimed the same version number.
The Stalker hop is therefore MIGRATION_29_30 here and the database is at v30, which
also moves the healSchema "last hop" duty onto it. Installs carrying either fork's
v29 converge on the same v30 shape.

Co-Authored-By: Claude Opus 5 (1M context) <noreply@anthropic.com>
</commit_message>
<xml_diff>
--- a/extras/OwnTV_Master_Product_Brief.docx
+++ b/extras/OwnTV_Master_Product_Brief.docx
@@ -58,7 +58,7 @@
           <w:color w:val="606060"/>
           <w:sz w:val="22"/>
         </w:rPr>
-        <w:t>Bring your own M3U, Xtream or Stalker (MAC) sources</w:t>
+        <w:t>Bring your own M3U, Xtream or Stalker/Ministra portal sources</w:t>
       </w:r>
     </w:p>
     <w:p>
@@ -86,7 +86,7 @@
           <w:i w:val="0"/>
           <w:sz w:val="22"/>
         </w:rPr>
-        <w:t>OwnTV is a native Android TV IPTV player built with Kotlin, Jetpack Compose for TV, and a dual playback engine — libmpv (FFmpeg) for movies, series, and maximum compatibility, and ExoPlayer (Media3) for near-instant Live TV. It is a player only: you bring your own Xtream login, M3U playlist (by URL or a local file on the device), or Stalker/Ministra portal (Portal URL + MAC address), and OwnTV provides a fast, modern, remote-first interface to browse and watch your content.</w:t>
+        <w:t>OwnTV is a native Android TV IPTV player built with Kotlin, Jetpack Compose for TV, and a dual playback engine — libmpv (FFmpeg) for movies, series, and maximum compatibility, and ExoPlayer (Media3) for near-instant Live TV. It is a player only: you bring your own Xtream login, M3U playlist (by URL or a local file on the device), or Stalker/Ministra portal (Portal URL + MAC address, with optional Serial Number, Device ID, Device ID2, and Signature for stricter portals), and OwnTV provides a fast, modern, remote-first interface to browse and watch your content.</w:t>
       </w:r>
     </w:p>
     <w:p>
@@ -1033,7 +1033,7 @@
         <w:pStyle w:val="ListBullet"/>
       </w:pPr>
       <w:r>
-        <w:t>Third source type alongside M3U and Xtream — added with a Portal URL + MAC address (no username/password)</w:t>
+        <w:t>Third source type alongside M3U and Xtream — added with Portal URL + MAC address (no username/password), plus optional Serial Number, Device ID, Device ID2, and Signature for portals that require advanced device identification</w:t>
       </w:r>
     </w:p>
     <w:p>
@@ -1041,7 +1041,7 @@
         <w:pStyle w:val="ListBullet"/>
       </w:pPr>
       <w:r>
-        <w:t>MAG handshake auth with in-memory tokens; MAG User-Agent presets (MAG250/254/270/420) + per-source override</w:t>
+        <w:t>MAG handshake auth with in-memory tokens; MAG User-Agent presets; optional Serial Number, Device ID, Device ID2, and Signature work in fresh setup, Remote setup, source add/edit, Test Connection, runtime reauthentication, and encrypted backups. Blank values preserve MAC-only behavior.</w:t>
       </w:r>
     </w:p>
     <w:p>
@@ -2641,7 +2641,7 @@
           <w:rFonts w:ascii="Cambria" w:hAnsi="Cambria"/>
           <w:sz w:val="22"/>
         </w:rPr>
-        <w:t>Stalker: core/stalker (StalkerClient/StalkerAuthManager/StreamUrlResolver) + StalkerSyncer; the portal cmd is stored in streamUrl and resolved to a playable URL at play time</w:t>
+        <w:t>Stalker/Ministra: portal handshake and get_profile authentication carry the stored MAC plus optional Serial Number, Device ID, Device ID2, and Signature through sync, playback, and runtime reauthentication; blank optional values are omitted for MAC-only portals.</w:t>
       </w:r>
     </w:p>
     <w:p>

</xml_diff>

<commit_message>
feat(home): add provider-matched Now Trending showcase
- build playable movie and series trends from TMDB candidates after catalogue sync
- add indexed title matching, flexible balancing, season availability and atomic snapshots
- show detailed Trending progress in the sync status pill and logcat
- add localized showcase actions, provider signals, full TMDB details and cast
- add per-profile Home visibility, availability messaging and backup-safe settings
- keep Trending focus stable and refine showcase auto-advance behavior
- harden the TMDB Worker with canonical caching, retries, timeouts and stale fallback
- add Room migrations, matching/parser tests and complete packaged translations
- update changelogs, README, user guide, Worker guide and product brief
</commit_message>
<xml_diff>
--- a/extras/OwnTV_Master_Product_Brief.docx
+++ b/extras/OwnTV_Master_Product_Brief.docx
@@ -926,6 +926,54 @@
       </w:r>
     </w:p>
     <w:p>
+      <w:pPr>
+        <w:pStyle w:val="ListBullet"/>
+      </w:pPr>
+      <w:r>
+        <w:t>Now Trending is the first Home row by default: up to 10 current TMDB movie/TV candidates are shown only after they match an exact playable title from the active provider; the target is five movies and five series, either type can fill unused places, and four matches are required to publish.</w:t>
+      </w:r>
+    </w:p>
+    <w:p>
+      <w:pPr>
+        <w:pStyle w:val="ListBullet"/>
+      </w:pPr>
+      <w:r>
+        <w:t>Trending matching is indexed and language-aware: exact normalized title/year candidates precede a narrow FTS fallback, provider variants prefer the selected language then English then untagged, and the saved provider row is revalidated before playback.</w:t>
+      </w:r>
+    </w:p>
+    <w:p>
+      <w:pPr>
+        <w:pStyle w:val="ListBullet"/>
+      </w:pPr>
+      <w:r>
+        <w:t>The Lora-styled showcase shows global TMDB rank/type, rating, provider match, language fallback, advertised quality/HDR/audio signals, and provider season count. Actions reuse the established Play/Open Episodes, Trailer, full TMDB Details (plot/cast/genres), and All Versions search flows.</w:t>
+      </w:r>
+    </w:p>
+    <w:p>
+      <w:pPr>
+        <w:pStyle w:val="ListBullet"/>
+      </w:pPr>
+      <w:r>
+        <w:t>Trending behaves as one focus row: internal D-pad moves never scroll Home; vertical movement occurs only when crossing rows. Auto-advance pauses on the four main actions, continues on Previous/Pause/Next, and also supports manual pause.</w:t>
+      </w:r>
+    </w:p>
+    <w:p>
+      <w:pPr>
+        <w:pStyle w:val="ListBullet"/>
+      </w:pPr>
+      <w:r>
+        <w:t>The post-sync worker reports candidate fetch, indexed-catalog preparation, movie/series matching, provider-season loading, enrichment and atomic publishing through a second status-pill line and matching logcat stages. It runs only when Home is shown and metadata mode includes TMDB.</w:t>
+      </w:r>
+    </w:p>
+    <w:p>
+      <w:pPr>
+        <w:pStyle w:val="ListBullet"/>
+      </w:pPr>
+      <w:r>
+        <w:t>Settings → Home screen can hide or reorder Trending and explains unavailable/below-threshold results. The per-profile Home setting is backed up; generated Trending snapshots and fetched metadata are deliberately rebuilt rather than exported.</w:t>
+      </w:r>
+    </w:p>
+    <w:p>
       <w:r>
         <w:rPr>
           <w:rFonts w:ascii="Cambria" w:hAnsi="Cambria" w:eastAsia="Cambria"/>
@@ -1920,7 +1968,7 @@
         <w:pStyle w:val="ListBullet"/>
       </w:pPr>
       <w:r>
-        <w:t>English plus 23 packaged translations cover the established 1,771-entry catalogue; newly added text safely falls back to English until translations catch up. Nineteen additional requested languages remain catalogue-only until they reach the reviewed readiness threshold.</w:t>
+        <w:t>English plus 23 packaged translations cover all 1,840 current source entries, including Now Trending and its Home setting. Nineteen additional requested languages remain catalogue-only until they reach the reviewed readiness threshold.</w:t>
       </w:r>
     </w:p>
     <w:p>
@@ -2201,11 +2249,7 @@
         <w:pStyle w:val="ListBullet"/>
       </w:pPr>
       <w:r>
-        <w:rPr>
-          <w:rFonts w:ascii="Cambria" w:hAnsi="Cambria"/>
-          <w:sz w:val="22"/>
-        </w:rPr>
-        <w:t>One file covers profiles, sources, customizations, favorites, watch history, resume positions, and app settings</w:t>
+        <w:t>One file covers profiles, sources, customizations, favorites, watch history, resume positions, and app settings, including each profile's Home row order/visibility. Generated Trending snapshots and fetched TMDB metadata are excluded and rebuilt after sync.</w:t>
       </w:r>
     </w:p>
     <w:p>
@@ -2645,6 +2689,36 @@
       </w:r>
     </w:p>
     <w:p>
+      <w:pPr/>
+      <w:r>
+        <w:t>Metadata &amp; Trending</w:t>
+      </w:r>
+    </w:p>
+    <w:p>
+      <w:pPr>
+        <w:pStyle w:val="ListBullet"/>
+      </w:pPr>
+      <w:r>
+        <w:t>MetadataRepository remains the shared lazy TMDB search/details cache. Trending uses its already-confirmed TMDB id to populate that same cache, so full details reuse the established movie/series cast and genre path without a second fuzzy title search.</w:t>
+      </w:r>
+    </w:p>
+    <w:p>
+      <w:pPr>
+        <w:pStyle w:val="ListBullet"/>
+      </w:pPr>
+      <w:r>
+        <w:t>TrendingRefreshWorker runs only after an eligible catalogue sync, prepares normalized/indexed provider titles, matches 25 movie plus 25 TV candidates, loads provider season availability, enriches up to 10 final items, then atomically replaces the source snapshot. TrendingActivityTracker mirrors detailed stages into the global sync status pill.</w:t>
+      </w:r>
+    </w:p>
+    <w:p>
+      <w:pPr>
+        <w:pStyle w:val="ListBullet"/>
+      </w:pPr>
+      <w:r>
+        <w:t>The self-hostable Cloudflare TMDB gateway canonicalizes cache keys, gives Trending a 15-minute fresh/24-hour stale policy and ordinary metadata a 30-day fresh/90-day stale policy, retries transient upstream failures once, enforces an eight-second timeout, and exposes request/cache diagnostics without exposing the TMDB key.</w:t>
+      </w:r>
+    </w:p>
+    <w:p>
       <w:r>
         <w:rPr>
           <w:rFonts w:ascii="Cambria" w:hAnsi="Cambria" w:eastAsia="Cambria"/>
@@ -2660,7 +2734,7 @@
         <w:pStyle w:val="ListBullet"/>
       </w:pPr>
       <w:r>
-        <w:t>Room schema: profiles &amp; sources (cross-ref for sharing), content (categories/channels/movies/series/seasons/episodes), per-profile favorites/history/progress/downloads, EPG channels/programmes, FTS4 search tables</w:t>
+        <w:t>Room schema: profiles &amp; sources (cross-ref for sharing), content (categories/channels/movies/series/seasons/episodes), per-profile favorites/history/progress/downloads, EPG channels/programmes, FTS4 search tables, and atomic per-source Trending snapshot/items plus indexed provider-title match columns.</w:t>
       </w:r>
     </w:p>
     <w:p>

</xml_diff>

<commit_message>
feat(appearance): add global font customization
- add app text sizing from 60% to 140% in 5% steps
- provide separate main-interface and popup font selection
- offer System Sans, Lora, Playfair Display, Dancing Script, and Poppins
- preserve the existing 100% / System Sans / Lora defaults
- stage changes until Apply, with Reset and Back behavior
- apply selected typography consistently across categories, lists, and popups
- keep subtitle typography controlled independently
- persist font preferences and include them in backup and restore
- translate the new settings across all supported interface languages
- keep focus on the selected language after changing interface language
- preserve the Language screen across script-changing activity refreshes
- include open-source font license notices
- remove Kotlin annotation and experimental R8 build warnings
- update changelogs, README, user guide, and product brief
</commit_message>
<xml_diff>
--- a/extras/OwnTV_Master_Product_Brief.docx
+++ b/extras/OwnTV_Master_Product_Brief.docx
@@ -2049,6 +2049,22 @@
           <w:sz w:val="22"/>
         </w:rPr>
         <w:t>UI zoom</w:t>
+      </w:r>
+    </w:p>
+    <w:p>
+      <w:pPr>
+        <w:pStyle w:val="ListBullet"/>
+      </w:pPr>
+      <w:r>
+        <w:t>Font customization — app text size from 60% to 140% in 5% steps, with independent main-interface and popup font selectors. Choices are System Sans, Lora, Playfair Display, Dancing Script, and Poppins; defaults remain 100%, System Sans, and Lora. Apply saves staged changes, Reset restores defaults, and Back cancels.</w:t>
+      </w:r>
+    </w:p>
+    <w:p>
+      <w:pPr>
+        <w:pStyle w:val="ListBullet"/>
+      </w:pPr>
+      <w:r>
+        <w:t>Font choices are available in every interface language, with Android font fallback for glyphs a selected family does not contain. The global choices survive restart and are included in backup/restore. Subtitle typography stays independent, and bundled font license notices are kept with the project.</w:t>
       </w:r>
     </w:p>
     <w:p>

</xml_diff>

<commit_message>
feat(appearance): complete UI and glass upgrade
- unify Live TV, Movies and Series inside shared browse containers
- add the compact navigation beacon and dynamic top-bar/rail sizing
- expand Glass Effect with six presets, real frost levels, adaptive readability and depth controls
- improve solid-mode surfaces and add optional Ambient Glow
- remove duplicate focus layers and scrolling shadows across controls
- keep panel-width customization compatible with the new layout
- give Now Trending a dedicated toggle and fixed top position
- update all bundled translations, tests and project documentation
</commit_message>
<xml_diff>
--- a/extras/OwnTV_Master_Product_Brief.docx
+++ b/extras/OwnTV_Master_Product_Brief.docx
@@ -930,7 +930,7 @@
         <w:pStyle w:val="ListBullet"/>
       </w:pPr>
       <w:r>
-        <w:t>Now Trending is the first Home row by default: up to 10 current TMDB movie/TV candidates are shown only after they match an exact playable title from the active provider; the target is five movies and five series, either type can fill unused places, and four matches are required to publish.</w:t>
+        <w:t>Now Trending is an optional but fixed first Home row: when enabled, 4-10 current TMDB movie/TV candidates are shown only after matching exact playable titles from the active provider; either type can fill unused places, and at least four matches are required to publish.</w:t>
       </w:r>
     </w:p>
     <w:p>
@@ -978,7 +978,7 @@
         <w:pStyle w:val="ListBullet"/>
       </w:pPr>
       <w:r>
-        <w:t>Settings → Home screen can hide or reorder Trending and explains unavailable/below-threshold results. The per-profile Home setting is backed up; generated Trending snapshots and fetched metadata are deliberately rebuilt rather than exported.</w:t>
+        <w:t>Settings → Home screen gives Trending its own On/Off option, separate from reorderable Home cards, and explains unavailable or below-threshold results. Enabled keeps it first; Off removes it. The per-profile choice is backed up, while generated snapshots and fetched metadata are rebuilt rather than exported.</w:t>
       </w:r>
     </w:p>
     <w:p>
@@ -1152,7 +1152,7 @@
           <w:rFonts w:ascii="Cambria" w:hAnsi="Cambria"/>
           <w:sz w:val="22"/>
         </w:rPr>
-        <w:t>Fixed, slim icon-only left rail: brand logo at the top, nav items vertically centered (scrollable at high UI zoom), profile avatar pinned at the bottom (click opens the profile switcher for any profile count; long-press opens the avatar picker with a new no-avatar silhouette option)</w:t>
+        <w:t>Fixed, slim icon-only left rail with its own matching background plate: brand logo at the top, compact beacon selection in the vertically centered menu (scrollable at high UI zoom), and profile avatar pinned at the bottom. Focus changes never paint a second rounded layer over the selected item.</w:t>
       </w:r>
     </w:p>
     <w:p>
@@ -1164,7 +1164,7 @@
           <w:rFonts w:ascii="Cambria" w:hAnsi="Cambria"/>
           <w:sz w:val="22"/>
         </w:rPr>
-        <w:t>Top bar above every section: active section name as a chip, Search pill (focusable, replaces the rail Search icon), live clock (updates every 15s), weather chip with Canvas weather symbols (sun, moon, cloud, rain, snow, thunderstorm via free Open-Meteo API), and active playlist/source name</w:t>
+        <w:t>Top bar above every section: active section chip, Search at the left of the controls, live clock, weather, active playlist/source and Continue. Normal browsing uses a compact bar and matching rail start; Audio Mode expands both automatically for its player controls.</w:t>
       </w:r>
     </w:p>
     <w:p>
@@ -1176,7 +1176,7 @@
           <w:rFonts w:ascii="Cambria" w:hAnsi="Cambria"/>
           <w:sz w:val="22"/>
         </w:rPr>
-        <w:t>Rounded content panels (Option A Clean + Premium): every screen sits inside rounded boxes (22dp corners, hairline outlineVariant borders, subtle surfaceContainerLowest fill). Movies, Series and Live normally use 3 boxes (category rail, content grid, preview); setting preview/poster to 0% removes the third box and its extra gap. Single-column screens use 1 box (Home, Search, Downloads, Guide, Settings).</w:t>
+        <w:t>One rounded browse container for Live TV, Movies and Series: category, list/grid and raised preview/poster regions sit inside one shared surface with deliberate gaps and separators. A 0% preview/poster removes that region and its gap. Home, Search, Downloads, Guide and Settings keep their purpose-built single-surface layouts.</w:t>
       </w:r>
     </w:p>
     <w:p>
@@ -2116,7 +2116,15 @@
         <w:pStyle w:val="ListBullet"/>
       </w:pPr>
       <w:r>
-        <w:t>Glass Effect — an opt-in, interaction-aware material with Clear, Balanced, Tinted and Custom presets; per-surface controls; custom transparency/frost; and local or remote wallpaper. Android 12+ uses one cached, aligned blurred backdrop, while older and no-wallpaper cases keep readable fallbacks. TV focus responds immediately, settles into full frost, and uses cached draw resources plus lightweight idle cards to prevent trailing bands and reduce low-end GPU work. The feature is off by default; its settings and wallpaper persist through backup/restore.</w:t>
+        <w:t>Glass Effect — an opt-in, interaction-aware material with Ultra Clear, Clear, Balanced, Tinted, Opaque and Custom choices; 20-100% tint, ten real frost levels, Highlight strength, adaptive readability, optional depth/parallax, live preview, per-surface controls, and local or remote wallpaper. Android 12+ uses one cached aligned blurred backdrop; older and no-wallpaper cases keep readable fallbacks. Focus responds immediately without trailing layers, then promotes full frost after settling. Settings and wallpaper persist through backup/restore; Glass remains off by default.</w:t>
+      </w:r>
+    </w:p>
+    <w:p>
+      <w:pPr>
+        <w:pStyle w:val="ListBullet"/>
+      </w:pPr>
+      <w:r>
+        <w:t>Ambient Glow — a separate opt-in radiance setting for the solid interface, hidden while Glass Effect is active. Glow is off by default; enabling it reveals an independent Slow pulse switch, and Animations Off freezes the pulse. The setting is translated, persists across restarts and is included in backup/restore.</w:t>
       </w:r>
     </w:p>
     <w:p>

</xml_diff>

<commit_message>
feat(settings): redesign Metadata and OpenSubtitles settings
- add dedicated Metadata and OpenSubtitles pages
- place OpenSubtitles below Metadata in the main settings list
- match both pages to the new layered mockup design
- add aligned service status and allowance panels
- show minute, hourly, and daily TMDB allowance details
- add underlined rows with distinct service-setting icons
- support personal API keys and custom Worker URLs
- add QR and PIN phone handover for both services
- include OpenSubtitles custom access in backup and restore
- show the OpenSubtitles quota reset countdown
- preserve shared popups and D-pad focus restoration
- update changelogs, README, user guide, and product brief
</commit_message>
<xml_diff>
--- a/extras/OwnTV_Master_Product_Brief.docx
+++ b/extras/OwnTV_Master_Product_Brief.docx
@@ -2836,6 +2836,14 @@
       </w:pPr>
       <w:r>
         <w:t>A personal TMDB key can be handed over from a phone: the companion LAN server gains a TMDB_KEY mode serving a one-field page, PIN-gated like the other Remote flows, so a 32-character key never has to be typed with a remote.</w:t>
+      </w:r>
+    </w:p>
+    <w:p>
+      <w:pPr>
+        <w:pStyle w:val="ListBullet"/>
+      </w:pPr>
+      <w:r>
+        <w:t>Settings now gives Metadata and OpenSubtitles separate main-list pages. Each page keeps its active service status and primary controls visible, while personal API keys, Worker/server URLs and QR + PIN companion handover live in compact shared popups with D-pad focus restoration. Server URL takes priority over API key; blank custom access uses the built-in service. OpenSubtitles custom access is included in backup/restore.</w:t>
       </w:r>
     </w:p>
     <w:p>

</xml_diff>

<commit_message>
feat(subtitles): add font selection and honor preferred language
- Add independent subtitle font selection across mpv, ExoPlayer, and app-rendered captions.
- Add Monospace to interface, popup, and subtitle font choices.
- Automatically enable matching preferred-language subtitle tracks.
- Restrict Ambient Glow to Dark mode with Glass off and hide its pulse ring when Pulse is disabled.
- Persist and back up subtitle font settings; add complete translations and tests.
</commit_message>
<xml_diff>
--- a/extras/OwnTV_Master_Product_Brief.docx
+++ b/extras/OwnTV_Master_Product_Brief.docx
@@ -507,7 +507,19 @@
           <w:rFonts w:ascii="Cambria" w:hAnsi="Cambria"/>
           <w:sz w:val="22"/>
         </w:rPr>
-        <w:t>Subtitle scale, preferred audio/subtitle language, and visibility settings</w:t>
+        <w:t>Subtitle appearance — independent font (Default, System Sans, Monospace, Lora, Playfair Display, Dancing Script, Poppins), scale, colour, position and background across mpv, ExoPlayer and app-drawn overlays; Default preserves authored styling</w:t>
+      </w:r>
+    </w:p>
+    <w:p>
+      <w:pPr>
+        <w:pStyle w:val="ListBullet"/>
+      </w:pPr>
+      <w:r>
+        <w:rPr>
+          <w:rFonts w:ascii="Cambria" w:hAnsi="Cambria"/>
+          <w:sz w:val="22"/>
+        </w:rPr>
+        <w:t>Preferred audio/subtitle language — automatically enables the matching subtitle track on both engines, including with same-language audio; language variants normalize and no unrelated fallback is selected</w:t>
       </w:r>
     </w:p>
     <w:p>
@@ -2132,7 +2144,7 @@
         <w:pStyle w:val="ListBullet"/>
       </w:pPr>
       <w:r>
-        <w:t>Font customization — app text size from 60% to 140% in 5% steps, with independent main-interface and popup font selectors. Choices are System Sans, Lora, Playfair Display, Dancing Script, and Poppins; defaults remain 100%, System Sans, and Lora. Apply saves staged changes, Reset restores defaults, and Back cancels.</w:t>
+        <w:t>UI text scale and font customization — 60% to 140% in 5% steps, with separate main-interface and popup choices: System Sans, Monospace, Lora, Playfair Display, Dancing Script and Poppins. Apply saves, Reset restores 100% / System Sans / Lora defaults, and Back cancels.</w:t>
       </w:r>
     </w:p>
     <w:p>
@@ -2140,7 +2152,7 @@
         <w:pStyle w:val="ListBullet"/>
       </w:pPr>
       <w:r>
-        <w:t>Font choices are available in every interface language, with Android font fallback for glyphs a selected family does not contain. The global choices survive restart and are included in backup/restore. Subtitle typography stays independent, and bundled font license notices are kept with the project.</w:t>
+        <w:t>Font choices are available in every interface language, with Android font fallback for glyphs a selected family does not contain. Interface and subtitle choices survive restarts and are included in backup/restore. Subtitle typography stays independently selectable across both players and app-drawn overlays; bundled font license notices are kept with the project.</w:t>
       </w:r>
     </w:p>
     <w:p>
@@ -2192,7 +2204,7 @@
         <w:pStyle w:val="ListBullet"/>
       </w:pPr>
       <w:r>
-        <w:t>Ambient Glow — a separate opt-in radiance setting for the solid interface, hidden while Glass Effect is active. Glow is off by default; enabling it reveals an independent Slow pulse switch, and Animations Off freezes the pulse. The setting is translated, persists across restarts and is included in backup/restore.</w:t>
+        <w:t>Ambient Glow — separate opt-in radiance for the solid interface, available only with the explicit Dark theme while Glass Effect is off. Slow pulse off shows only the soft aura; turning it on adds the animated ring, and Animations Off freezes its motion. The setting is translated, persists across restarts and is included in backup/restore.</w:t>
       </w:r>
     </w:p>
     <w:p>

</xml_diff>